<commit_message>
Update Tide Mother thumbnails to match the final script
Co-Authored-By: Claude Opus 5.5 <noreply@anthropic.com>
Claude-Session: https://claude.ai/code/session_01YJE41d5btXjxgncsbRHMm3
</commit_message>
<xml_diff>
--- a/fableon/the-tide-mother/FABLEON-The-Tide-Mother-Production-Pack-v5.docx
+++ b/fableon/the-tide-mother/FABLEON-The-Tide-Mother-Production-Pack-v5.docx
@@ -52376,6 +52376,18 @@
       </w:pPr>
       <w:r>
         <w:rPr>
+          <w:i/>
+          <w:iCs/>
+        </w:rPr>
+        <w:t xml:space="preserve">Updated for the final 28-minute script: the village law and drowning stone from the prologue, the cliff procession, and Tal waiting underwater for Maren. Visuals follow the original FABLEON Visual Style Profile.</w:t>
+      </w:r>
+    </w:p>
+    <w:p>
+      <w:pPr>
+        <w:spacing w:after="120"/>
+      </w:pPr>
+      <w:r>
+        <w:rPr>
           <w:b/>
           <w:bCs/>
         </w:rPr>
@@ -52608,7 +52620,27 @@
         <w:t xml:space="preserve">Text overlay:</w:t>
       </w:r>
       <w:r>
-        <w:t xml:space="preserve"> "THE / TIDE / MOTHER" stacked bottom-right over Tal's jaw in chiselled ivory-to-steel-teal serif. Gold "4K UHD" badge top-right.</w:t>
+        <w:t xml:space="preserve"> "THE / TIDE / MOTHER" stacked bottom-right over Tal's jaw in chiselled ivory-to-steel-teal serif. Gold "4K UHD" badge top-right. </w:t>
+      </w:r>
+      <w:r>
+        <w:rPr>
+          <w:b/>
+          <w:bCs/>
+        </w:rPr>
+        <w:t xml:space="preserve">A/B variant:</w:t>
+      </w:r>
+      <w:r>
+        <w:t xml:space="preserve"> replace the title with Maren's line from the film, </w:t>
+      </w:r>
+      <w:r>
+        <w:rPr>
+          <w:i/>
+          <w:iCs/>
+        </w:rPr>
+        <w:t xml:space="preserve">"HE'S A CHILD!"</w:t>
+      </w:r>
+      <w:r>
+        <w:t xml:space="preserve">, in narrow spaced serif across the top.</w:t>
       </w:r>
     </w:p>
     <w:p>
@@ -52744,7 +52776,7 @@
         <w:pStyle w:val="Heading2"/>
       </w:pPr>
       <w:r>
-        <w:t xml:space="preserve">Thumbnail 3 — "Thrown to the Sea" (injustice and shock)</w:t>
+        <w:t xml:space="preserve">Thumbnail 3 — "The Law of Kelvhaven" (injustice and shock, built on the prologue law)</w:t>
       </w:r>
     </w:p>
     <w:p>
@@ -52764,7 +52796,7 @@
         <w:t xml:space="preserve">Visual concept:</w:t>
       </w:r>
       <w:r>
-        <w:t xml:space="preserve"> a high-angle shot from the top of the cliff. Maren falls backward toward the black churning sea with her arms outstretched, ankles tied to a stone and her green shawl streaming upward. Beneath the waves directly under her, a huge cyan glowing eye and the shadow of a dragon are rising to meet her. At the top edge of the frame, the angry mob with orange torches looks down.</w:t>
+        <w:t xml:space="preserve"> a high-angle shot from the top of the cliff. In the foreground, the ancient drowning stone with deep rope grooves. A rope runs from it to Maren, who is falling backward toward the black churning sea, arms outstretched, her moss-green shawl streaming upward. Beneath the waves directly under her, a huge cyan glowing eye and the shadow of a dragon are rising to meet her. Along the top edge of the frame, the silent villagers and Hesk with his carved staff look down.</w:t>
       </w:r>
     </w:p>
     <w:p>
@@ -52784,7 +52816,7 @@
         <w:t xml:space="preserve">Text overlay:</w:t>
       </w:r>
       <w:r>
-        <w:t xml:space="preserve"> "THEY CALLED HER A WITCH" in a narrow spaced serif across the top, plus a red serif "…" (or no text, since the image tells the story).</w:t>
+        <w:t xml:space="preserve"> "WHATEVER THE SEA GIVES…" across the top in a narrow, widely spaced ivory serif, and "…THE SEA TAKES BACK" in smaller crimson serif at the bottom. This is the village law from the prologue, so the thumbnail matches the first line viewers hear.</w:t>
       </w:r>
     </w:p>
     <w:p>
@@ -52804,7 +52836,7 @@
         <w:t xml:space="preserve">Emotion trigger:</w:t>
       </w:r>
       <w:r>
-        <w:t xml:space="preserve"> injustice and suspense. Viewers want to see her saved and the mob punished.</w:t>
+        <w:t xml:space="preserve"> injustice, plus an open question. Viewers learn the law, see it being carried out, and see the eye rising below, so they click to find out whether the sea takes her or gives her back.</w:t>
       </w:r>
     </w:p>
     <w:p>
@@ -52824,7 +52856,7 @@
         <w:t xml:space="preserve">Prompt:</w:t>
       </w:r>
       <w:r>
-        <w:t xml:space="preserve"> Photorealistic cinematic movie-poster key art, dark fantasy, dramatic high-angle view down a black basalt sea cliff. Maren, a woman about 30 with long dark-brown hair streaming upward, a moss-green shawl flying and a faded indigo wool dress, falls backward toward a churning black-teal sea with her arms outstretched and a rope and heavy stone tied to her ankles. Directly beneath the waves, a colossal sea dragon's luminous cyan eye and a vast pearl-and-teal silhouette rise to meet her, glowing electric blue through the water. At the top edge of the frame, a silhouetted medieval mob holds orange torches against a storm sky. Gale wind, sea spray, slow-motion feeling. Cold slate and navy palette with cyan glow and orange torch accents. Leave the top strip clean for text. 16:9 YouTube thumbnail 1280x720, high contrast, film grain.</w:t>
+        <w:t xml:space="preserve"> Photorealistic cinematic movie-poster key art, dark fantasy, dramatic high-angle view down a black basalt sea cliff in a gale. In the foreground, an ancient weathered stone with deep rope grooves at the cliff edge, a rope running from it over the edge. Maren, a woman about 30 with long wet tangled dark-brown hair streaming upward, a single thin braid on the left, a faded indigo wool dress and a moss-green knitted shawl flying, falls backward toward a churning black-teal sea with her arms outstretched and a rope and heavy stone tied to her ankles. Directly beneath the waves, a colossal sea dragon's luminous cyan slit-pupil eye and a vast pearl-and-teal silhouette rise to meet her, glowing electric blue through the water. Along the top edge, silhouetted villagers in undyed wool and an old man with a long white beard and a carved staff look down. Flat overcast storm light, sea spray, desaturated slate and navy palette with Tal's cyan glow the only saturated color. Leave the top and bottom strips clean for text. 16:9 YouTube thumbnail 1280x720, high contrast, film grain.</w:t>
       </w:r>
     </w:p>
     <w:p>
@@ -52920,7 +52952,7 @@
         <w:pStyle w:val="Heading2"/>
       </w:pPr>
       <w:r>
-        <w:t xml:space="preserve">Thumbnail 5 — "His Tears" (grief close-up, works for the main video and for Shorts)</w:t>
+        <w:t xml:space="preserve">Thumbnail 5 — "He Waited" (grief and loyalty; main video A/B and Shorts)</w:t>
       </w:r>
     </w:p>
     <w:p>
@@ -52940,7 +52972,7 @@
         <w:t xml:space="preserve">Visual concept:</w:t>
       </w:r>
       <w:r>
-        <w:t xml:space="preserve"> an extreme close-up of adult Tal's face in profile at night by the water, a single glowing tear running down his pearl scales and his cyan eye full of grief, looking down at Maren's moss-green shawl caught on a rock in the surf. Soft fog background.</w:t>
+        <w:t xml:space="preserve"> deep underwater, the colossal Tal lies curled around a rock on the dark sea floor, his tail wrapped tight, one huge glowing cyan eye open and fixed on the faint light of the surface far above. A tiny silhouette of the cliff and the shapes of people are just visible through the surface. His veins glow dimly, like a heart beating slowly.</w:t>
       </w:r>
     </w:p>
     <w:p>
@@ -52960,7 +52992,17 @@
         <w:t xml:space="preserve">Text overlay:</w:t>
       </w:r>
       <w:r>
-        <w:t xml:space="preserve"> a white handwritten-style italic script at the bottom, "They threw his mother into the sea…" (for the Short), or just a small serif "THE TIDE MOTHER" for the long-form version.</w:t>
+        <w:t xml:space="preserve"> a white handwritten-style italic caption at the bottom, </w:t>
+      </w:r>
+      <w:r>
+        <w:rPr>
+          <w:i/>
+          <w:iCs/>
+        </w:rPr>
+        <w:t xml:space="preserve">"He waited exactly where she told him to stay…"</w:t>
+      </w:r>
+      <w:r>
+        <w:t xml:space="preserve">, built from the script's "Exactly where she told him to stay. Low. And quiet." For the long-form version, use a small serif "THE TIDE MOTHER" instead.</w:t>
       </w:r>
     </w:p>
     <w:p>
@@ -52980,7 +53022,7 @@
         <w:t xml:space="preserve">Emotion trigger:</w:t>
       </w:r>
       <w:r>
-        <w:t xml:space="preserve"> grief and heartbreak, aimed at the core female 25–55 audience. It mirrors MYTHRA's "They killed his mother…" Short, which got 223K views.</w:t>
+        <w:t xml:space="preserve"> loyalty and heartbreak, aimed at the core female 25–55 audience. It ties to the "Stay low. Stay quiet." callback, which repeats through the film, and leaves viewers asking whether she comes back to him or he goes to her.</w:t>
       </w:r>
     </w:p>
     <w:p>
@@ -53000,7 +53042,7 @@
         <w:t xml:space="preserve">Prompt:</w:t>
       </w:r>
       <w:r>
-        <w:t xml:space="preserve"> Photorealistic cinematic key art, dark fantasy, extreme close-up profile of a colossal sea dragon's face at night, iridescent pearl-grey and abalone-teal scales beaded with water, a crown of frilled spines, a luminous cyan slit-pupil eye full of grief, a single glowing tear running down its scales. It looks down at a moss-green knitted shawl caught on a black rock in the dark surf. Soft drifting fog, cold moonlight with a faint electric-blue glow, a desaturated silver-grey background. Leave a clean strip along the bottom for a script caption. 16:9 YouTube thumbnail 1280x720 (also crop 9:16 for Shorts), ultra-sharp eye detail, shallow depth of field, film grain.</w:t>
+        <w:t xml:space="preserve"> Photorealistic cinematic key art, dark fantasy, deep underwater in a cold northern sea. A colossal sea dragon with iridescent pearl and teal scales, deep sea-blue manta-fin wings folded, a crown of frilled spines and bioluminescent blue veins glowing dimly, lies curled around a rock on the dark sea floor, tail wrapped tight, one huge luminous cyan slit-pupil eye open and gazing up at the faint, rippling light of the surface far above. Drifting particles, kelp silhouettes, dim cold blue-green light with shafts from above. Desaturated deep navy palette, the dragon's cyan glow the only saturated color. Leave a clean strip along the bottom for a caption. 16:9 YouTube thumbnail 1280x720 (also crop 9:16 for Shorts), ultra-sharp eye detail, film grain.</w:t>
       </w:r>
     </w:p>
     <w:p>
@@ -53032,7 +53074,17 @@
         <w:t xml:space="preserve">#1</w:t>
       </w:r>
       <w:r>
-        <w:t xml:space="preserve">, which is the proven MYTHRA layout recolored. Use YouTube's Test &amp; Compare with </w:t>
+        <w:t xml:space="preserve">, the proven MYTHRA layout. Use YouTube's Test &amp; Compare with </w:t>
+      </w:r>
+      <w:r>
+        <w:rPr>
+          <w:b/>
+          <w:bCs/>
+        </w:rPr>
+        <w:t xml:space="preserve">#3</w:t>
+      </w:r>
+      <w:r>
+        <w:t xml:space="preserve"> (the village law hook) and </w:t>
       </w:r>
       <w:r>
         <w:rPr>
@@ -53042,7 +53094,17 @@
         <w:t xml:space="preserve">#2</w:t>
       </w:r>
       <w:r>
-        <w:t xml:space="preserve"> and </w:t>
+        <w:t xml:space="preserve">. Use </w:t>
+      </w:r>
+      <w:r>
+        <w:rPr>
+          <w:b/>
+          <w:bCs/>
+        </w:rPr>
+        <w:t xml:space="preserve">#2</w:t>
+      </w:r>
+      <w:r>
+        <w:t xml:space="preserve"> for the trailer, with "OFFICIAL TRAILER" in small spaced serif. Keep </w:t>
       </w:r>
       <w:r>
         <w:rPr>
@@ -53052,7 +53114,7 @@
         <w:t xml:space="preserve">#4</w:t>
       </w:r>
       <w:r>
-        <w:t xml:space="preserve">. Keep </w:t>
+        <w:t xml:space="preserve"> for the Part 2 teaser, and </w:t>
       </w:r>
       <w:r>
         <w:rPr>
@@ -53062,17 +53124,7 @@
         <w:t xml:space="preserve">#5</w:t>
       </w:r>
       <w:r>
-        <w:t xml:space="preserve"> for Shorts and the community post, and </w:t>
-      </w:r>
-      <w:r>
-        <w:rPr>
-          <w:b/>
-          <w:bCs/>
-        </w:rPr>
-        <w:t xml:space="preserve">#3</w:t>
-      </w:r>
-      <w:r>
-        <w:t xml:space="preserve"> for the Part 2 teaser.</w:t>
+        <w:t xml:space="preserve"> for Shorts and the community post.</w:t>
       </w:r>
     </w:p>
     <w:sectPr>

</xml_diff>